<commit_message>
publish reports — 2026-06-26
</commit_message>
<xml_diff>
--- a/2026-06-26/2026-06-26 简报.docx
+++ b/2026-06-26/2026-06-26 简报.docx
@@ -43,7 +43,7 @@
           <w:b/>
           <w:sz w:val="21"/>
         </w:rPr>
-        <w:t>中国财政部启动50亿欧元主权债，料创史上最大欧元发行</w:t>
+        <w:t>苹果微软上调硬件售价，AI内存成本两年涨四倍引爆亚洲科技股抛售</w:t>
       </w:r>
     </w:p>
     <w:p>
@@ -60,7 +60,7 @@
           <w:b/>
           <w:sz w:val="21"/>
         </w:rPr>
-        <w:t>全国人大常委会闭幕，商标法第五次修订并加重审计造假处罚</w:t>
+        <w:t>国际原子能机构要求全面核查伊朗核计划，德黑兰拒绝开放视察</w:t>
       </w:r>
     </w:p>
     <w:p>
@@ -77,7 +77,7 @@
           <w:b/>
           <w:sz w:val="21"/>
         </w:rPr>
-        <w:t>习近平会见孟加拉国总理拉赫曼，两国签13份谅解备忘录</w:t>
+        <w:t>安森美70亿美元全股票收购Synaptics，创公司史上最大并购</w:t>
       </w:r>
     </w:p>
     <w:p>
@@ -94,7 +94,7 @@
           <w:b/>
           <w:sz w:val="21"/>
         </w:rPr>
-        <w:t>中国对日稀土断供半年，G7谋划价格下限式战略储备</w:t>
+        <w:t>英国综合PMI跌破荣枯线，英格兰银行维持利率4.25%</w:t>
       </w:r>
     </w:p>
     <w:p>
@@ -111,7 +111,7 @@
           <w:b/>
           <w:sz w:val="21"/>
         </w:rPr>
-        <w:t>智谱AI旗舰GLM-5.2引爆新一轮"DeepSeek时刻"</w:t>
+        <w:t>Wise公布创纪录年度业绩并宣布5亿美元股票回购</w:t>
       </w:r>
     </w:p>
     <w:p>
@@ -128,7 +128,7 @@
           <w:b/>
           <w:sz w:val="21"/>
         </w:rPr>
-        <w:t>东京6月核心CPI升至1.6%，基础通胀逼近日本央行2%目标</w:t>
+        <w:t>欧盟第21轮对俄制裁谈判升温，油价上限与渔产品禁令成分歧焦点</w:t>
       </w:r>
     </w:p>
     <w:p>
@@ -145,7 +145,7 @@
           <w:b/>
           <w:sz w:val="21"/>
         </w:rPr>
-        <w:t>软银暴跌12%拖累日经收跌4%，OpenAI拟将IPO推迟至2027</w:t>
+        <w:t>马格德堡圣诞市场袭击者被判终身监禁</w:t>
       </w:r>
     </w:p>
     <w:p>
@@ -162,7 +162,7 @@
           <w:b/>
           <w:sz w:val="21"/>
         </w:rPr>
-        <w:t>日本三大在野党党首同意启动正式合并磋商</w:t>
+        <w:t>中国财政部启动50亿欧元主权债发行，规模料创历史之最</w:t>
       </w:r>
     </w:p>
     <w:p>
@@ -179,7 +179,7 @@
           <w:b/>
           <w:sz w:val="21"/>
         </w:rPr>
-        <w:t>台风"米克拉"逼近冲绳，逾120航班取消铁路停运波及全国</w:t>
+        <w:t>全国人大常委会表决通过商标法与注册会计师法修订</w:t>
       </w:r>
     </w:p>
     <w:p>
@@ -196,7 +196,7 @@
           <w:b/>
           <w:sz w:val="21"/>
         </w:rPr>
-        <w:t>KOSPI盘中暴跌逾8%触发熔断，半导体抛售收跌5.81%</w:t>
+        <w:t>六只新股同日挂牌港交所募资25亿美元创纪录</w:t>
       </w:r>
     </w:p>
     <w:p>
@@ -213,7 +213,7 @@
           <w:b/>
           <w:sz w:val="21"/>
         </w:rPr>
-        <w:t>韩国前第一夫人金建希因斡旋受贿被判七年监禁</w:t>
+        <w:t>东京6月核心CPI同比上涨1.6%，强化日本央行加息预期</w:t>
       </w:r>
     </w:p>
     <w:p>
@@ -230,7 +230,7 @@
           <w:b/>
           <w:sz w:val="21"/>
         </w:rPr>
-        <w:t>三星集团拟投资1000万亿韩元向首都圈外扩张芯片产能</w:t>
+        <w:t>软银股价暴跌12%，OpenAI拟将重磅IPO推迟至2027年</w:t>
       </w:r>
     </w:p>
     <w:p>
@@ -247,7 +247,7 @@
           <w:b/>
           <w:sz w:val="21"/>
         </w:rPr>
-        <w:t>SK海力士拟294亿美元纳斯达克ADR上市，料创历史最大规模</w:t>
+        <w:t>韩国KOSPI盘中暴跌逾8%触发熔断，收盘重挫5.81%</w:t>
       </w:r>
     </w:p>
     <w:p>
@@ -264,7 +264,7 @@
           <w:b/>
           <w:sz w:val="21"/>
         </w:rPr>
-        <w:t>朝鲜金正恩督导新型火箭炮试验，射程覆盖首尔</w:t>
+        <w:t>前第一夫人金建希因斡旋受贿被判七年监禁</w:t>
       </w:r>
     </w:p>
     <w:p/>
@@ -276,7 +276,7 @@
           <w:b/>
           <w:sz w:val="24"/>
         </w:rPr>
-        <w:t>1.中国财政部启动50亿欧元主权债，料创史上最大欧元发行</w:t>
+        <w:t>1.苹果微软上调硬件售价，AI内存成本两年涨四倍引爆亚洲科技股抛售</w:t>
       </w:r>
     </w:p>
     <w:p>
@@ -286,7 +286,7 @@
           <w:b w:val="0"/>
           <w:sz w:val="21"/>
         </w:rPr>
-        <w:t>中国财政部6月26日启动50亿欧元（约57亿美元）主权债发行，路透社所见条款清单显示，这笔交易若完成将成为中国有史以来规模最大的欧元主权债，分三档定价：5年期为中期掉期利率加3个基点，8年期加12个基点，12年期加22个基点，结算日定于7月3日。这是中国连续第二年加码回归欧元债市场——2024年9月时隔三年重返仅发行20亿欧元，2025年11月在卢森堡首发欧元主权债升至40亿欧元、认购量逼近发行额的25倍，此次再上一台阶并仍经由卢森堡发行。承销团扩至16家银行，横跨地缘分野：除中国银行、交通银行、农业银行、建设银行（亚洲）、中金公司、工商银行等中资机构外，还包括美银证券、花旗、高盛（亚洲）、摩根大通等四大美资行，以及法国农业信贷、德意志银行、汇丰、法国兴业银行、渣打银行和瑞银等欧洲银行。发债当日离岸人民币（CNH）兑美元走弱至6.80附近，有望连续第二周下跌，美联储转向鹰派后市场对9月加息的定价概率升至75%。 [1]</w:t>
+        <w:t>苹果6月26日将旗下Mac与iPad全线产品提价至多25%，理由是AI数据中心需求推动内存与存储元件成本飙升：基础款MacBook Air从1,099美元涨至1,299美元，基础款MacBook Pro从1,699美元涨至1,999美元，iPad Air基础价从599美元涨至749美元，Mac Studio M3 Ultra从3,999美元跳升至5,299美元。苹果发言人称公司"从未见过元件价格在如此短时间内上涨如此之多"。微软同步宣布Xbox主机自8月1日起涨价，Xbox Series S升至500美元、Series X最高升至800美元，理由是"主机存储与内存价格已上涨逾2.5倍"。根源在于DRAM与NAND闪存自2025年以来价格翻了两番，厂商将产能优先投向AI服务器所需的高带宽内存（HBM）；数据中心在2026年消耗了全球约70%的内存产量。涨价消息引爆亚洲科技股抛售：苹果股价下跌逾6%，韩国SK海力士与三星电子一度双双下跌逾10%，日本铠侠（Kioxia）暴跌至多14%，带动MSCI亚太信息技术指数下挫6.4%。当日美股标普500指数下跌0.75%，纳斯达克综合指数下跌1.25%。 [1]</w:t>
       </w:r>
     </w:p>
     <w:p/>
@@ -297,7 +297,7 @@
           <w:b/>
           <w:sz w:val="24"/>
         </w:rPr>
-        <w:t>2.全国人大常委会闭幕，商标法第五次修订并加重审计造假处罚</w:t>
+        <w:t>2.国际原子能机构要求全面核查伊朗核计划，德黑兰拒绝开放视察</w:t>
       </w:r>
     </w:p>
     <w:p>
@@ -307,7 +307,7 @@
           <w:b w:val="0"/>
           <w:sz w:val="21"/>
         </w:rPr>
-        <w:t>十四届全国人大常委会第二十三次会议6月26日在北京闭幕，会期6月23日至26日，表决通过三部法律案。其一为商标法第五次修订，是十余年来中国商标制度最重大的一次重塑：扩大对非传统商标的保护，引入反恶意注册机制，赋予国家知识产权局（CNIPA）对缺乏真实使用意图、明显超出正常经营所需或申请人有恶意注册记录的申请主动驳回与撤销权，并将异议期从三个月缩短至两个月。其二为注册会计师法修订，将出具虚假审计报告的最高罚款从违法所得的5倍上调至10倍，增设暂停业务、吊销执照与从业禁令，并将责任延伸至与会计师串通的相关方，延续了普华永道因恒大审计失职受罚后北京打击财务造假的力度。其三为律师法修订草案，提交公开征求意见；金融法草案、中国人民银行法、政府采购法和招标投标法修订草案则审议但未通过。商标法此前已于3月13日经国务院原则通过，公开征求意见从2025年12月27日持续至2026年2月9日。 [2]</w:t>
+        <w:t>国际原子能机构总干事拉斐尔·格罗西（Rafael Grossi）6月26日在日本召开的记者会上要求建立"一套非常强有力的核查体系"，对伊朗核计划进行全面视察。"已经达成了协议，而要遵守该协议，原子能机构就必须获得准入并实施视察，"格罗西说。这番表态出现在美伊双方相互矛盾的说法之间——伊朗副外长卡泽姆·加里巴巴迪（Kazem Gharibabadi）6月25日称目前"没有计划允许视察员进入"，并将视察与美国终止制裁挂钩；美方则坚称视察在特朗普总统与伊朗总统马苏德·佩泽什基安（Masoud Pezeshkian）6月17日远程签署的14点谅解备忘录中已"完全商定"。2025年6月美国与以色列对伊朗核设施发动打击后，伊朗中止了与原子能机构的合作，直至同年9月才恢复有限的视察员准入。机构估计冲突前伊朗持有440.9公斤丰度高达60%的浓缩铀；伊朗至今未允许进入遭轰炸的设施，其浓缩铀库存仍下落不明。 [2]</w:t>
       </w:r>
     </w:p>
     <w:p/>
@@ -318,7 +318,7 @@
           <w:b/>
           <w:sz w:val="24"/>
         </w:rPr>
-        <w:t>3.习近平会见孟加拉国总理拉赫曼，两国签13份谅解备忘录</w:t>
+        <w:t>3.安森美70亿美元全股票收购Synaptics，创公司史上最大并购</w:t>
       </w:r>
     </w:p>
     <w:p>
@@ -328,7 +328,7 @@
           <w:b w:val="0"/>
           <w:sz w:val="21"/>
         </w:rPr>
-        <w:t>孟加拉国总理塔里克·拉赫曼（Tarique Rahman）6月26日在北京人民大会堂会见中国国家主席习近平，这是其四天访华行程的最后一天，也是拉赫曼就任总理以来首次访华。前一天即6月25日，拉赫曼已会见国务院总理李强，会后两国签署13份谅解备忘录，涵盖战略合作、贸易、投资、就业、发展项目及人文交流，另签两份协议。拉赫曼今年2月率孟加拉国民族主义党（BNP）在大选中胜出，结束人民联盟15年执政，对华姿态由前任的相对谨慎转向更主动接触；中国已是孟最大贸易伙伴与投资来源，2024至25财年双边贸易额超210亿美元，近乎孟印贸易的两倍。此访聚焦缩减孟方对华贸易逆差、推动出口多元化，并争取中国对一带一路框架下大型基建的支持，同时探讨绿色能源、数字发展与AI合作。双方还讨论了孟方采购24架歼-10CE战机一事，与更广泛的防务合作议程挂钩，这笔约22亿美元的军购已在印度引发战略关切。 [3]</w:t>
+        <w:t>安森美半导体（onsemi）6月25日与Synaptics签署最终的重组协议与计划，将以全股票交易收购Synaptics，总企业价值约70亿美元，为安森美史上最大并购。Synaptics每股将换取1.350股安森美普通股，这一固定换股比例较两家公司股票10日成交量加权平均收盘价隐含约19%的溢价；Synaptics股东预计将持有合并后公司约12%的完全摊薄股份，交易已获两家公司董事会一致批准。交易预计于2027年中完成，有待Synaptics股东批准和监管核准。安森美表示，此次收购将把其总潜在市场到2030年扩大300亿美元至2,430亿美元，并预计在交易完成后18个月内对非GAAP每股收益产生增厚作用，预期年度协同效应达2亿美元。战略意图在于把以汽车和工业系统芯片见长的安森美，与以人机界面和连接技术著称的Synaptics结合，引入其边缘计算平台、无线连接产品组合，加速安森美向"物理AI"推进。 [3]</w:t>
       </w:r>
     </w:p>
     <w:p/>
@@ -339,7 +339,7 @@
           <w:b/>
           <w:sz w:val="24"/>
         </w:rPr>
-        <w:t>4.中国对日稀土断供半年，G7谋划价格下限式战略储备</w:t>
+        <w:t>4.英国综合PMI跌破荣枯线，英格兰银行维持利率4.25%</w:t>
       </w:r>
     </w:p>
     <w:p>
@@ -349,7 +349,7 @@
           <w:b w:val="0"/>
           <w:sz w:val="21"/>
         </w:rPr>
-        <w:t>据彭博6月26日报道，在中日多年来最严峻的地缘对峙中，中国正动用其关键矿产主导地位反制日本——自2026年1月起重稀土（镝、铽、镓）对日出货已基本停滞，至5月仅有极少量流通，氧化钕镨价格在1月至6月间上涨六倍。中国于1月6日正式宣布出口管制，针对稀土元素、永磁体等两用技术与关键矿产，以回应日本首相高市早苗（Sanae Takaichi）2025年11月将"台湾遭攻击"与日本生存性安全威胁挂钩的表态。这一反制的杠杆在于结构性依赖：中国掌控全球约90%的稀土磁体生产与精炼，2024年日本从中国进口超520万公斤稀土金属、占其稀土进口总量的63%，而镝、铽是电动车、工业电机、风机及国防系统所用高性能钕铁硼永磁体的关键原料，目前几乎无可替代。2026年6月，日本提出由G7协调的稀土战略储备倡议并设价格下限，以Lynas-JARE协议的110美元/公斤、5,000公吨作为钕和镨至2038年的参考下限；G7领导人同意协调储备，到2030年将对任一非G7单一供应国的依赖度降至60%以下。 [4]</w:t>
+        <w:t>英国6月23日公布的综合采购经理人指数（PMI）初值跌至49.4，为一年多来首次跌破50的荣枯分界线，其中服务业活动指数报48.7，低于市场预期的50.0。PMI破50意味着私营部门经济活动整体陷入收缩，这是该指标连续第二个月低于荣枯线，服务业下滑幅度为2023年1月以来最陡，企业裁员加速、新订单走弱是主要拖累。英国财政部（HM Treasury）6月26日发布其月度《英国经济预测》汇编六月号，汇总伦敦金融城与学界经济学家对增长与财政的独立预测，涵盖当年及次年的GDP增长中枢、CPI通胀、经常账户余额估计，以及失业率和工资增长预期。通胀仍高于英格兰银行（Bank of England）2%的目标，货币政策委员会（MPC）在6月会议上将基准利率维持在4.25%。 [4]</w:t>
       </w:r>
     </w:p>
     <w:p/>
@@ -360,7 +360,7 @@
           <w:b/>
           <w:sz w:val="24"/>
         </w:rPr>
-        <w:t>5.智谱AI旗舰GLM-5.2引爆新一轮"DeepSeek时刻"</w:t>
+        <w:t>5.Wise公布创纪录年度业绩并宣布5亿美元股票回购</w:t>
       </w:r>
     </w:p>
     <w:p>
@@ -370,7 +370,7 @@
           <w:b w:val="0"/>
           <w:sz w:val="21"/>
         </w:rPr>
-        <w:t>总部位于北京的智谱AI（国际名Z.ai）旗舰模型GLM-5.2正引来美国开发者的盛赞浪潮，他们称其为首个可靠到能用于日常编程工作流的开源权重模型，这一反应被广泛比作新一轮"DeepSeek时刻"。曾任Meta与谷歌DeepMind副总裁的Matt Velloso在X上表示，他已"用了一整天"GLM-5.2，认为这是"首个达标、可作为日常主力的开源模型"，并称"局面不会再和从前一样了"；在与OpenAI今年4月发布的闭源模型GPT-5.5对比时，他称这款中国模型"更切中要害，不啰嗦，不绕圈子解释自己，直接把活干了"。该模型于6月13日发布，本周达到顶峰的背书浪潮才是真正的新闻，重演了2025年1月DeepSeek R1登顶美国应用商店、单日抹去英伟达约5,890亿美元市值、被称为"AI斯普特尼克时刻"的动态。发布时点颇具象征意味：就在GLM-5.2上线前一天，美国领先实验室Anthropic为遵守华盛顿一项封锁外国用户的指令下架了其最先进的公开模型，而采用开源权重、可任意自托管的中国模型恰恰不受此类访问限制约束。 [5]</w:t>
+        <w:t>伦敦上市的金融科技支付公司Wise PLC于6月26日公布截至2026年3月的财年创纪录全年业绩，并宣布一项5亿美元的股票回购计划。公司披露净营收达25亿美元，营收同比增长约25%，活跃客户增长21%至1900万，跨境支付额激增31%至2435亿美元；5亿美元回购约相当于Wise市值的3%。消息公布后，Wise伦敦股价一度上涨约7.2%至889.8便士。首席执行官克里斯托·凯尔曼（Kristo Käärmann）表示，这一增长印证了客户持续从传统银行转向低成本跨境金融服务的趋势。 [5]</w:t>
       </w:r>
     </w:p>
     <w:p/>
@@ -381,7 +381,7 @@
           <w:b/>
           <w:sz w:val="24"/>
         </w:rPr>
-        <w:t>6.东京6月核心CPI升至1.6%，基础通胀逼近日本央行2%目标</w:t>
+        <w:t>6.欧盟第21轮对俄制裁谈判升温，油价上限与渔产品禁令成分歧焦点</w:t>
       </w:r>
     </w:p>
     <w:p>
@@ -391,7 +391,7 @@
           <w:b w:val="0"/>
           <w:sz w:val="21"/>
         </w:rPr>
-        <w:t>日本总务省统计局6月26日公布，东京都6月核心CPI（含能源、不含生鲜食品）同比上涨1.6%，与市场预测中值持平，是八个月来东京核心通胀首次回升；整体CPI同比涨幅由5月的1.4%升至1.7%。真正引起日本银行（BoJ）注意的是剔除生鲜食品与能源的"核心核心"CPI同比上涨1.9%，较5月的1.6%明显加速，逼近央行2%的通胀目标——这一被央行视为衡量基础通胀趋势最清晰的读数回升，意味着物价压力正从能源向食品、服务等非能源领域扩散。东京数据领先全国约三周，全国6月CPI将于7月公布。日本央行6月16日已以7票赞成、1票反对将政策利率上调25个基点至1.0%、为1995年以来最高，委员浅田（Asada）投下唯一反对票；政策委员会将于7月下旬召开季度评估会议，数据走强压缩了央行7月按兵不动的空间，市场对更早加息的押注随之升温。 [6]</w:t>
+        <w:t>欧盟成员国就第21轮对俄制裁方案的内部分歧正在加剧，争议焦点包括一项渔产品进口禁令，以及一项设定了7月15日截止期限的油价上限修订，保加利亚总统鲁门·拉德夫（Rumen Radev）对其中部分具体条款公开表示反对。这一揽子方案由欧盟委员会于6月9日提出，覆盖金融、加密资产、能源与贸易，拟首次将渔业纳入制裁，对部分鱼产品实施"实质性限制"并对包括鳕鱼在内的品类全面禁运；"影子船队"制裁名单拟在已有的632艘基础上再增30艘，并首次延伸至为影子船队提供加油等支持服务的船只。委员会还提议暂停油价上限调整机制至2027年1月，以在霍尔木兹海峡等地缘紧张背景下稳定市场。该方案须经全体成员国一致批准方能生效。 [6]</w:t>
       </w:r>
     </w:p>
     <w:p/>
@@ -402,7 +402,7 @@
           <w:b/>
           <w:sz w:val="24"/>
         </w:rPr>
-        <w:t>7.软银暴跌12%拖累日经收跌4%，OpenAI拟将IPO推迟至2027</w:t>
+        <w:t>7.马格德堡圣诞市场袭击者被判终身监禁</w:t>
       </w:r>
     </w:p>
     <w:p>
@@ -412,7 +412,7 @@
           <w:b w:val="0"/>
           <w:sz w:val="21"/>
         </w:rPr>
-        <w:t>软银集团（TSE: 9984）6月26日股价暴跌12.28%，收于6,211日元，抹去本周早些时候累积的8%涨幅，作为单只个股最大拖累将日经225指数拖累至收跌3.7%、报69,704.88点，几乎吐回周四4.6%的纪录性涨幅，东证Topix指数则仅跌1.18%。抛售导火索是《纽约时报》报道称OpenAI正考虑将首次公开募股推迟至2027年，而非原定的今年下半年。软银对这家ChatGPT开发商的投资预计到10月将达约650亿美元，董事长兼CEO孙正义（Masayoshi Son）押注激进，此前对IPO套现的预期一度将软银市值短暂推上超过丰田的历史高位。OpenAI推迟上市的背景是估值与市场情绪承压：顾问以SpaceX在6月以1.77万亿美元估值上市后股价回落为由建议谨慎，公司上一年度净亏损385亿美元、对应340亿美元算力与研发支出，而CEO山姆·奥尔特曼（Sam Altman）力推1万亿美元IPO估值并据报拒绝让步。半导体相关股普遍承压，爱德万测试跌9.89%、铠侠跌约9%、东京电子跌3.42%，跟随隔夜纳斯达克连续第四个交易日下挫。 [7]</w:t>
+        <w:t>德国马格德堡一家法院6月26日判处现年51岁的塔利布·阿尔-阿卜杜勒莫森（Taleb al Abdulmohsen）终身监禁，认定其犯有6项谋杀罪和338项谋杀未遂罪，辩护律师伯特歇尔（Böttcher）表示被告不接受这一判决。2024年12月20日，这名沙特裔精神科医生驾驶一辆租来的SUV冲入拥挤的圣诞市场，造成6人死亡、逾300人受伤，遇难者包括一名9岁男童和五名45至75岁的女性。侦查发现凶手并非出于圣战动机，而是抱持强烈的反伊斯兰立场并同情极右翼政治，包括德国选择党（AfD）。法院认定此案"情节特别严重"，意味着阿卜杜勒莫森日后获释的可能性将被大幅压低；宣判时他被铐在防弹玻璃隔间内听取裁决。 [7]</w:t>
       </w:r>
     </w:p>
     <w:p/>
@@ -423,7 +423,7 @@
           <w:b/>
           <w:sz w:val="24"/>
         </w:rPr>
-        <w:t>8.日本三大在野党党首同意启动正式合并磋商</w:t>
+        <w:t>8.中国财政部启动50亿欧元主权债发行，规模料创历史之最</w:t>
       </w:r>
     </w:p>
     <w:p>
@@ -433,7 +433,7 @@
           <w:b w:val="0"/>
           <w:sz w:val="21"/>
         </w:rPr>
-        <w:t>中道改革联盟（Centrist Reform Alliance, CRA）、立宪民主党（CDP）与公明党三大在野党党首6月26日会面，同意设立正式机构讨论三党合并；CRA党首小川淳也（Junya Ogawa）于6月19日提出该倡议，立宪民主党尽管党内存有保留意见仍批准参与，三党干事长将于下周启动有关组织、政策与选举合作的磋商。两大阵营时间表不同：公明党党首竹谷俊子（Toshiko Takeya）态度积极，称"我们应在本届国会会期结束前就一定方向达成一致，组建中道势力联盟"；立宪民主党党首水冈俊一（Shunichi Mizuoka）则更审慎，称"我们希望充分讨论这一问题，因此不应在磋商开始前就设定目标"。合并动议的背景是在野阵营严重弱势：在2026年2月众议院大选中，执政的自民党（LDP）单独斩获316席的三分之二绝对多数，加上执政伙伴日本维新会（JIP）在465席中掌控352席，CRA仅获49席。在高市早苗（Sanae Takaichi）领导的执政联盟占据压倒性多数的格局下，这是面向2028年年中参议院选举的战略布局，本届例行国会会期将于7月17日结束。 [8]</w:t>
+        <w:t>中国财政部6月26日启动50亿欧元（约合57亿美元）主权债发行，路透社看到的条款清单显示，这笔交易若顺利完成，将成为中国有史以来规模最大的欧元主权债。发行分三档：5年期定价为中期掉期利率加3个基点，8年期加12个基点，12年期加22个基点，结算日定于7月3日。这是中国连续第二年回归欧元债市场并明显加码——2024年财政部时隔三年重返欧元市场仅发行20亿欧元，2025年11月首次在卢森堡发行规模升至40亿欧元，认购量一度逼近发行额的25倍。承销团扩至16家银行，既有中国银行、交通银行、中金公司、工商银行等中资机构，也包括美银证券、花旗、高盛（亚洲）、摩根大通等美资行，以及法国农业信贷、德意志银行、汇丰、瑞银等欧洲银行。发债当日，离岸人民币（CNH）兑美元走弱至6.80附近，有望连续第二周下跌。 [8]</w:t>
       </w:r>
     </w:p>
     <w:p/>
@@ -444,7 +444,7 @@
           <w:b/>
           <w:sz w:val="24"/>
         </w:rPr>
-        <w:t>9.台风"米克拉"逼近冲绳，逾120航班取消铁路停运波及全国</w:t>
+        <w:t>9.全国人大常委会表决通过商标法与注册会计师法修订</w:t>
       </w:r>
     </w:p>
     <w:p>
@@ -454,7 +454,7 @@
           <w:b w:val="0"/>
           <w:sz w:val="21"/>
         </w:rPr>
-        <w:t>2026年第7号台风"米克拉"（Mekkhala）6月26日上午逼近冲绳本岛，截至日本时间上午9时位于久米岛以北约120公里处、以每小时20公里向北偏东移动，日本气象厅（JMA）就山体滑坡、低洼积水及河流暴涨发出警告。更复杂的是双台风格局：第8号台风"希高斯"（Higos）正自冲绳以南海域北上，两者预计将发生罕见的"藤原效应"相互作用，并可能于6月26日深夜至27日在本州以南海域合并，使台风偏离预报路径、行为难以预测。当日单日航班取消逾120架次：全日空（ANA）取消52班、主要涉及那霸石垣航线、约10,570名旅客受影响，日本航空（JAL）取消70班、涉及冲绳鹿儿岛奄美、约4,500名旅客受影响。铁路停运波及关东，JR东日本全天停运总武线（佐仓至铫子）等区段，"日出濑户"与"日出出云"夜行卧铺列车全部停开，JR西日本削减冈山福山地区班次；中日本高速道路公司警告东名、新东名高速可能自6月27日起封闭。气象厅预报东海地区24小时降雨量最高可达300毫米，"米克拉"将于周末持续向东海、关东方向移动逼近东京湾。 [9]</w:t>
+        <w:t>十四届全国人大常委会第二十三次会议6月26日在北京闭幕，会期为6月23日至26日，表决通过三部法律案。其一是商标法第五次修正，扩大对非传统商标的保护，引入反恶意注册机制，赋予国家知识产权局（CNIPA）主动撤销权，并将异议期从三个月缩短至两个月，对协助滥用申请的商标代理机构加重处罚，被视为十余年来中国商标制度最重大的一次重塑。其二是注册会计师法修订，将出具虚假审计报告的最高罚款上调至违法所得的10倍（此前为5倍），在情节严重时增设暂停业务、吊销执照和从业禁令，并将责任延伸至与会计师串通出具虚假报告的相关方，延续了北京在资本市场打击财务造假的力度。其三是律师法修订草案，提交公开征求意见。会议还审议（但未通过）金融法草案、中国人民银行法修订草案、政府采购法修订草案和招标投标法修订草案。 [9]</w:t>
       </w:r>
     </w:p>
     <w:p/>
@@ -465,7 +465,7 @@
           <w:b/>
           <w:sz w:val="24"/>
         </w:rPr>
-        <w:t>10.KOSPI盘中暴跌逾8%触发熔断，半导体抛售收跌5.81%</w:t>
+        <w:t>10.六只新股同日挂牌港交所募资25亿美元创纪录</w:t>
       </w:r>
     </w:p>
     <w:p>
@@ -475,7 +475,7 @@
           <w:b w:val="0"/>
           <w:sz w:val="21"/>
         </w:rPr>
-        <w:t>韩国交易所6月26日约中午12时10分对KOSPI启动熔断机制，此前指数跌幅一度超过8%、跌731.97点（8.19%）至8,198.33点，全部上市股票、期货与期权交易随之暂停20分钟，为韩国交易所2026年第五次熔断；早盘11时12分KOSPI 200期货已下跌5%触发卖方熔断（sidecar）。KOSPI最终收跌519.09点（5.81%）报8,411.21点，KOSDAQ跌4.10%，下跌个股以777比111远超上涨个股。抛售集中在半导体权重股：三星电子跌5.3%至33.95万韩元，SK海力士重挫8.36%至267万韩元，SK Square跌9.43%。资金面呈现散户与外资、机构对立：个人投资者净买入8.2万亿韩元，外资净卖出4.6万亿韩元、机构净卖出3.8万亿韩元。这场震荡发生在史无前例的大涨之后——KOSPI年内一度从年初的4,309.63点飙升、6月18日盘中首次站上9,000点，但行情高度集中于两只芯片股而暴露于情绪反转。Kiwoom证券分析师韩智英（Han Ji-young）指出："今天的急跌大部分可以用市场过度集中于半导体股、以及由此引发的资金流动剧烈波动来解释"，并补充投资者担心"存储芯片过于昂贵会抬高终端产品价格，进而削弱对存储芯片的需求"。 [10]</w:t>
+        <w:t>六家中国公司6月26日同日在港交所挂牌，合计募资约198亿港元（25亿美元），为香港2026年单日募资规模之最，将年内港股IPO及二次上市募资额推高至216亿美元，同比增长51%。尽管当日恒指下跌、恒生科技指数走低，多数新股仍录得强劲首日涨幅。领益智造（1688 HK）是苹果、华为、三星的精密零件供应商兼AI硬件制造商，募资83亿港元（11亿美元），发行价10.18港元，收涨3%；21名基石投资者认购4.07亿美元，占募资额40%。思瑞浦（3661 HK）以H股二次上市募资46亿港元（5.87亿美元），开盘大涨23.4%。芯碁微装/CFMEE（9630 HK）是全球最大的PCB直写设备制造商，募资32.5亿港元（4.10亿美元），开盘暴涨73.7%，公开发售获1,009倍超额认购。其余三只新股中，中科闻歌（1956 HK）首日涨81.2%，科拓泊车（2272 HK）首日飙涨178.4%，印尼金矿商PT Merdeka Gold Resources（6228 HK）收平于26.60港元。 [10]</w:t>
       </w:r>
     </w:p>
     <w:p/>
@@ -486,7 +486,7 @@
           <w:b/>
           <w:sz w:val="24"/>
         </w:rPr>
-        <w:t>11.韩国前第一夫人金建希因斡旋受贿被判七年监禁</w:t>
+        <w:t>11.东京6月核心CPI同比上涨1.6%，强化日本央行加息预期</w:t>
       </w:r>
     </w:p>
     <w:p>
@@ -496,7 +496,7 @@
           <w:b w:val="0"/>
           <w:sz w:val="21"/>
         </w:rPr>
-        <w:t>首尔中央地方法院6月26日判处前第一夫人、被罢免总统尹锡悦之妻金建希（Kim Keon Hee）七年监禁，认定其依据《特定犯罪加重处罚法》斡旋受贿罪名成立，检方此前求刑七年六个月。法院认定，金建希在2022年3月至5月间明知而收受瑞喜建设（Suh Hee Construction）会长李奉宽（Lee Bong-kwan）赠送的约1.038亿韩元（约6.8万美元）奢侈珠宝——包括一条价值5,560万韩元的梵克雅宝项链、蒂芙尼胸针、格拉夫耳环以及一只价值265万韩元的金龟摆件——作为支持李奉宽亲属李培镕（Lee Bae-yong）出任国家教育委员会职务的回报。法院称："被告必须已认识到，这些礼品超出了一般社交礼节，是基于对等回报的预期而赠送的。"这是金建希一系列司法案件中的最新一环：今年1月她曾因受贿被判监禁，4月二审在股价操纵案上被改判加重，七年刑期是迄今对韩国前第一夫人量刑最重者之一。 [11]</w:t>
+        <w:t>日本总务省统计局6月26日公布，东京都6月核心CPI（含能源、不含生鲜食品）同比上涨1.6%，与市场预测中值持平，是八个月来东京核心通胀首次回升，整体CPI同比涨幅升至1.7%。真正引起央行注意的是剔除生鲜食品与能源的"核心核心"CPI同比上涨1.9%，较5月的1.6%明显加速，逼近日本银行（BoJ）2%的通胀目标——这一被央行视为衡量基础通胀趋势最清晰的读数回升，意味着物价压力正从能源向食品、服务等非能源领域扩散。日本央行6月16日已以7票赞成、1票反对将政策利率上调25个基点至1.0%，为1995年以来最高水平，委员浅田（Asada）投下唯一反对票。政策委员会将于7月下旬召开季度评估会议并更新增长与通胀预测；东京数据走强压缩了央行在7月按兵不动的空间，市场对更早加息的押注随之升温，全国6月CPI将于7月公布。 [11]</w:t>
       </w:r>
     </w:p>
     <w:p/>
@@ -507,7 +507,7 @@
           <w:b/>
           <w:sz w:val="24"/>
         </w:rPr>
-        <w:t>12.三星集团拟投资1000万亿韩元向首都圈外扩张芯片产能</w:t>
+        <w:t>12.软银股价暴跌12%，OpenAI拟将重磅IPO推迟至2027年</w:t>
       </w:r>
     </w:p>
     <w:p>
@@ -517,7 +517,7 @@
           <w:b w:val="0"/>
           <w:sz w:val="21"/>
         </w:rPr>
-        <w:t>三星集团正制定一项未来十年高达1000万亿韩元（6,460亿美元）的本土长期投资计划，其中超过350万亿韩元投向半导体与AI生态，并可能划拨300万亿韩元在西南部新建芯片工厂——这一总额甚至超过韩国2026年全年728万亿韩元的政府预算。三星电子会长李在镕（Lee Jae-yong）与SK海力士首席执行官郭鲁正（Kwak Noh-jung）将于6月29日（周一）在总统李在明主持的总统府简报会上公布计划。投资重点转向首都圈以外，是因为平泽、龙仁等现有半导体集群在大型输电网络与新增供电能力上已接近饱和，新增产能必须另觅区位。总统府政策室长金容范（Kim Yong-beom）坦言："这些数字太过庞大，关于它们是否属实必将引发激烈争论。"这场巨额投资的底气来自半导体超级周期：SK海力士股价年内飙升约250%，6月22日市值首次超越三星电子登顶KOSPI，两家公司5月合计占KOSPI权重逾42%并双双跻身万亿美元市值行列。 [12]</w:t>
+        <w:t>软银集团（TSE: 9984）6月26日股价暴跌12.28%，收于6,211日元，抹去本周早些时候累积的8%涨幅，拖累日经225指数收跌3.7%至69,704.88点。导火索是《纽约时报》报道称OpenAI正考虑将首次公开募股推迟至2027年，而非原定的今年第三或第四季度。分歧的核心是估值：CEO山姆·奥尔特曼（Sam Altman）力推1万亿美元的IPO估值，远高于该公司上一轮7,300亿至8,520亿美元的私募估值，据报道他坚拒在这一目标上让步。重新评估的直接导火索是SpaceX——这家公司6月以约1.77万亿美元估值上市后股价持续下滑，回落至约153美元，引发投资者对生成式AI商业回报能否匹配天量基础设施成本的质疑。OpenAI上一年度净亏损385亿美元，对应340亿美元的算力与研发支出。对软银而言，孙正义（Masayoshi Son）这笔到10月将达约650亿美元的OpenAI投资是其近年押注AI的核心，上市延后意味着投资回报兑现的时间表被推迟。半导体相关股普遍承压，爱德万测试（Advantest）跌9.89%，铠侠跌9%。 [12]</w:t>
       </w:r>
     </w:p>
     <w:p/>
@@ -528,7 +528,7 @@
           <w:b/>
           <w:sz w:val="24"/>
         </w:rPr>
-        <w:t>13.SK海力士拟294亿美元纳斯达克ADR上市，料创历史最大规模</w:t>
+        <w:t>13.韩国KOSPI盘中暴跌逾8%触发熔断，收盘重挫5.81%</w:t>
       </w:r>
     </w:p>
     <w:p>
@@ -538,7 +538,7 @@
           <w:b w:val="0"/>
           <w:sz w:val="21"/>
         </w:rPr>
-        <w:t>SK海力士计划在纳斯达克发行美国存托凭证（ADR），最高募资294亿美元，将发行1,779万股新股（约占已发行股本的2.5%）、对应价值45.45万亿韩元，若完成将超越阿里巴巴2014年纽约上市募资218亿美元的纪录、成为史上最大ADR发行。ADR交易定于7月10日启动，认购与结算定于7月14日，承销团包括美银证券、花旗环球金融、高盛与摩根大通证券。募集资金将用于龙仁半导体集群Y1工厂、用于高带宽存储（HBM）的清州P&amp;T7先进封装工厂，并向ASML采购EUV光刻机；由于SK海力士已在首尔上市，纳斯达克路径是旨在对标美光、争取美股同业估值的二次上市。这笔上市恰逢韩元持续疲软：韩元兑美元汇率周四收于1,542.7，周五一度触及1,550、为2009年3月以来最弱水平。Hana Bank高级研究员徐正勋（Seo Jeong-hoon）认为："如果通过ADR发行募集的资金全部汇回韩国，将对韩元构成支撑。" [13]</w:t>
+        <w:t>韩国交易所6月26日约中午12时10分对KOSPI启动熔断机制，此前指数跌幅一度超过8%，全部KOSPI上市股票、期货与期权交易随之暂停20分钟——暂停时KOSPI已下跌731.97点（8.19%）至8198.33点，为韩国交易所2026年第五次熔断。KOSPI最终收跌519.09点（5.81%），报8411.21点；KOSDAQ下挫4.10%。抛售集中在半导体权重股：三星电子下跌5.3%，SK海力士重挫8.36%至267万韩元，SK Square下跌9.43%。当日资金面呈现散户与机构、外资对立——个人投资者净买入8.2万亿韩元，外资净卖出4.6万亿韩元，机构净卖出3.8万亿韩元。这场震荡发生在韩国股市史无前例的大涨之后：KOSPI今年累计涨幅一度超过80%，本周刚首次站上9000点，SK海力士股价年内飙升约250%并于6月22日市值首次超越三星电子；三星与SK海力士5月合计占KOSPI权重超过42%，集中度风险随之放大。证券分析师指出，投资者担心存储芯片过于昂贵会抬高终端产品价格，进而削弱对存储芯片的需求。 [13]</w:t>
       </w:r>
     </w:p>
     <w:p/>
@@ -549,7 +549,7 @@
           <w:b/>
           <w:sz w:val="24"/>
         </w:rPr>
-        <w:t>14.朝鲜金正恩督导新型火箭炮试验，射程覆盖首尔</w:t>
+        <w:t>14.前第一夫人金建希因斡旋受贿被判七年监禁</w:t>
       </w:r>
     </w:p>
     <w:p>
@@ -574,7 +574,7 @@
           <w:b w:val="0"/>
           <w:sz w:val="21"/>
         </w:rPr>
-        <w:t>朝鲜领导人金正恩督导了一款新型240毫米口径24管多管火箭炮系统以及配备增程弹的155毫米榴弹炮试验，时值1950至1953年朝鲜战争爆发76周年，据韩国联合参谋本部通报朝方共发射约10发火箭弹。试验突出射程提升：升级版多管火箭炮的射程延伸至90公里，155毫米榴弹炮的增程弹打到65公里——足以覆盖距边界约50公里、人口稠密设施密集的首尔及首都圈，被韩国军方评估为针对韩国的常规打击武器而非远程目标。金正恩称："让敌人持续感到不安与恐惧，正是行使战争威慑力的一个重要方面。"韩国军方将所涉武器评估为多管火箭炮而非短程弹道导弹，未就此次试验对外发布通报。这与近期朝鲜频繁的军备动作一脉相承，也恰逢同日总统李在明在华盛顿一场和平论坛呼吁重启朝美及韩朝对话，凸显李在明对话优先的姿态与平壤扩充常规打击能力之间的落差。 [14]</w:t>
+        <w:t>首尔中央地方法院6月26日判处前第一夫人、被罢免总统尹锡悦之妻金建希（Kim Keon Hee）七年监禁。法院认定，金建希在2022年3月至5月间，明知而收受瑞喜建设会长李奉宽（Lee Bong-kwan）赠送的约1.038亿韩元（约6.8万美元）奢侈珠宝，作为为其女婿谋取政府职位的回报；涉案礼品包括一条价值5560万韩元的梵克雅宝（Van Cleef &amp; Arpels）项链、蒂芙尼胸针、格拉夫耳环，以及一只价值265万韩元的金龟摆件。作为对价，李奉宽的亲属李培镕获任国家教育委员会职务。法院依据《特定犯罪加重处罚法》认定其斡旋受贿罪名成立，检方此前求刑七年六个月。这是金建希一系列司法案件中最新的一环——今年1月她曾因受贿被判20个月监禁，4月二审在股价操纵罪上被改判加重至4年监禁并处罚金；特别检察官此前对其及亲信展开为期180天的调查，最终在31起案件中逮捕20人、起诉76人。 [14]</w:t>
       </w:r>
     </w:p>
     <w:p/>
@@ -634,7 +634,7 @@
                 <w:b w:val="0"/>
                 <w:sz w:val="20"/>
               </w:rPr>
-              <w:t>https://www.thestandard.com.hk/finance/article/335657/China-launches-euro-bond-sale-of-US57-billion-term-sheet-shows</w:t>
+              <w:t>https://www.aljazeera.com/economy/2026/6/26/apple-microsoft-hike-prices-over-surging-chip-costs</w:t>
             </w:r>
           </w:p>
         </w:tc>
@@ -668,7 +668,7 @@
                 <w:b w:val="0"/>
                 <w:sz w:val="20"/>
               </w:rPr>
-              <w:t>https://npcobserver.com/legislation/trademark-law/</w:t>
+              <w:t>https://www.aljazeera.com/news/2026/6/26/iaea-demands-strong-verification-of-irans-nuclear-programme</w:t>
             </w:r>
           </w:p>
         </w:tc>
@@ -702,7 +702,7 @@
                 <w:b w:val="0"/>
                 <w:sz w:val="20"/>
               </w:rPr>
-              <w:t>https://www.newagebd.net/post/foreign-affairs/304046/bangladesh-pm-joins-meeting-with-chinese-president-xi-jinping</w:t>
+              <w:t>https://uk.finance.yahoo.com/news/onsemi-buy-synaptics-7-billion-103844164.html</w:t>
             </w:r>
           </w:p>
         </w:tc>
@@ -736,7 +736,7 @@
                 <w:b w:val="0"/>
                 <w:sz w:val="20"/>
               </w:rPr>
-              <w:t>https://www.bloomberg.com/news/newsletters/2026-06-26/china-leverages-its-critical-minerals-advantage-against-japan</w:t>
+              <w:t>https://www.gov.uk/government/statistics/forecasts-for-the-uk-economy-june-2026</w:t>
             </w:r>
           </w:p>
         </w:tc>
@@ -770,7 +770,7 @@
                 <w:b w:val="0"/>
                 <w:sz w:val="20"/>
               </w:rPr>
-              <w:t>https://www.scmp.com/tech/big-tech/article/3358434/chinas-zhipu-ai-sparks-new-deepseek-moment-cost-effective-coding-model</w:t>
+              <w:t>https://www.proactiveinvestors.co.uk/companies/news/1094546/wise-unveils-500m-share-buyback-after-strong-results-1094546.html</w:t>
             </w:r>
           </w:p>
         </w:tc>
@@ -804,7 +804,7 @@
                 <w:b w:val="0"/>
                 <w:sz w:val="20"/>
               </w:rPr>
-              <w:t>https://www.japantimes.co.jp/business/2026/06/26/economy/tokyo-inflation-picks-up-june/</w:t>
+              <w:t>https://www.euronews.com/my-europe/2026/06/26/newsletter-temperatures-rise-over-sanctions-against-russia</w:t>
             </w:r>
           </w:p>
         </w:tc>
@@ -838,7 +838,7 @@
                 <w:b w:val="0"/>
                 <w:sz w:val="20"/>
               </w:rPr>
-              <w:t>https://asia.nikkei.com/business/markets/softbank-shares-slipped-over-12-on-concerns-of-openai-ipo-delay</w:t>
+              <w:t>https://www.euronews.com/my-europe/2026/06/26/life-sentence-for-magdeburg-attacker</w:t>
             </w:r>
           </w:p>
         </w:tc>
@@ -872,7 +872,7 @@
                 <w:b w:val="0"/>
                 <w:sz w:val="20"/>
               </w:rPr>
-              <w:t>https://www.nippon.com/en/news/yjj2026062600310/</w:t>
+              <w:t>https://www.thestandard.com.hk/finance/article/335657/China-launches-euro-bond-sale-of-US57-billion-term-sheet-shows</w:t>
             </w:r>
           </w:p>
         </w:tc>
@@ -906,7 +906,7 @@
                 <w:b w:val="0"/>
                 <w:sz w:val="20"/>
               </w:rPr>
-              <w:t>https://www.nippon.com/en/news/yjj2026062600296/typhoon-mekkhala-nears-okinawa's-main-island.html</w:t>
+              <w:t>https://npcobserver.com/legislation/trademark-law/</w:t>
             </w:r>
           </w:p>
         </w:tc>
@@ -940,7 +940,7 @@
                 <w:b w:val="0"/>
                 <w:sz w:val="20"/>
               </w:rPr>
-              <w:t>https://www.koreaherald.com/article/10789600</w:t>
+              <w:t>https://www.thestar.com.my/business/business-news/2026/06/26/hong-kong-listing-debutants-jump-as-hang-seng-falls-apple-supplier-lingyi-up-3</w:t>
             </w:r>
           </w:p>
         </w:tc>
@@ -974,7 +974,7 @@
                 <w:b w:val="0"/>
                 <w:sz w:val="20"/>
               </w:rPr>
-              <w:t>https://www.koreaherald.com/article/10789757</w:t>
+              <w:t>https://finance.yahoo.com/economy/articles/tokyo-june-core-cpi-rises-234033058.html</w:t>
             </w:r>
           </w:p>
         </w:tc>
@@ -1008,7 +1008,7 @@
                 <w:b w:val="0"/>
                 <w:sz w:val="20"/>
               </w:rPr>
-              <w:t>https://www.koreaherald.com/article/10789340</w:t>
+              <w:t>https://asia.nikkei.com/business/markets/softbank-shares-slipped-over-12-on-concerns-of-openai-ipo-delay</w:t>
             </w:r>
           </w:p>
         </w:tc>
@@ -1042,7 +1042,7 @@
                 <w:b w:val="0"/>
                 <w:sz w:val="20"/>
               </w:rPr>
-              <w:t>https://www.koreatimes.co.kr/economy/others/20260626/sk-hynix-nasdaq-adr-listing-seen-as-potential-support-for-won-amid-prolonged-weakness</w:t>
+              <w:t>https://www.koreaherald.com/article/10789600</w:t>
             </w:r>
           </w:p>
         </w:tc>
@@ -1076,7 +1076,7 @@
                 <w:b w:val="0"/>
                 <w:sz w:val="20"/>
               </w:rPr>
-              <w:t>https://www.koreaherald.com/article/10788918</w:t>
+              <w:t>https://www.koreaherald.com/article/10789757</w:t>
             </w:r>
           </w:p>
         </w:tc>

</xml_diff>